<commit_message>
Update tech doc with rigorous justification for choosing MLP vs LSTM/Windowed models
</commit_message>
<xml_diff>
--- a/PINN_Technical_Architecture.docx
+++ b/PINN_Technical_Architecture.docx
@@ -120,6 +120,22 @@
     </w:p>
     <w:p>
       <w:r>
+        <w:rPr>
+          <w:b/>
+        </w:rPr>
+        <w:t>Architectural Choice: Why MLP? (And why NOT LSTMs or Transformers?)</w:t>
+        <w:br/>
+      </w:r>
+      <w:r>
+        <w:t xml:space="preserve">In standard time-series forecasting, recurrent models like LSTMs or Transformers are used to process discrete 'windows' of past data (Sequence Modeling). However, a PINN operates fundamentally differently: it is a Continuous Function Approximator. </w:t>
+        <w:br/>
+        <w:br/>
+        <w:t>We strictly use a Multi-Layer Perceptron (MLP) mapping a single coordinate (t) directly to a state (i). This point-by-point architecture is mandatory because PINNs rely on PyTorch/TensorFlow's Automatic Differentiation (Autograd). Autograd requires the network to act as a fully differentiable continuous function to calculate the exact, analytical derivative (di/dt) needed for the physical ODE loss. If we used a discrete window of points (like an LSTM), the model would become discrete, and calculating the exact analytical derivative of the output with respect to continuous time would be mathematically ill-posed, breaking the physics constraint entirely.</w:t>
+      </w:r>
+    </w:p>
+    <w:p>
+      <w:r>
+        <w:br/>
         <w:t>The architecture consists of two parallel Multi-Layer Perceptrons (MLPs) designed to overcome 'spectral bias' (the mathematical tendency of neural networks to prioritize learning low-frequency functions over high-frequency ones).</w:t>
       </w:r>
       <w:r>

</xml_diff>